<commit_message>
docs: update supervisor and student author names on official cover page
</commit_message>
<xml_diff>
--- a/docs/reports/PBL6_Bao_Cao.docx
+++ b/docs/reports/PBL6_Bao_Cao.docx
@@ -65,7 +65,7 @@
       <w:tr>
         <w:tc>
           <w:tcPr>
-            <w:tcW w:type="dxa" w:w="3312"/>
+            <w:tcW w:type="dxa" w:w="3168"/>
             <w:tcMar>
               <w:top w:w="50" w:type="dxa"/>
               <w:bottom w:w="50" w:type="dxa"/>
@@ -86,7 +86,7 @@
         </w:tc>
         <w:tc>
           <w:tcPr>
-            <w:tcW w:type="dxa" w:w="6192"/>
+            <w:tcW w:type="dxa" w:w="6336"/>
             <w:tcMar>
               <w:top w:w="50" w:type="dxa"/>
               <w:bottom w:w="50" w:type="dxa"/>
@@ -101,7 +101,7 @@
                 <w:color w:val="111827"/>
                 <w:sz w:val="26"/>
               </w:rPr>
-              <w:t>TS. NGUYỄN THẾ XUÂN LY</w:t>
+              <w:t>NGUYỄN NĂNG HÙNG VĂN</w:t>
             </w:r>
           </w:p>
         </w:tc>
@@ -109,7 +109,7 @@
       <w:tr>
         <w:tc>
           <w:tcPr>
-            <w:tcW w:type="dxa" w:w="3312"/>
+            <w:tcW w:type="dxa" w:w="3168"/>
             <w:tcMar>
               <w:top w:w="50" w:type="dxa"/>
               <w:bottom w:w="50" w:type="dxa"/>
@@ -130,7 +130,7 @@
         </w:tc>
         <w:tc>
           <w:tcPr>
-            <w:tcW w:type="dxa" w:w="6192"/>
+            <w:tcW w:type="dxa" w:w="6336"/>
             <w:tcMar>
               <w:top w:w="50" w:type="dxa"/>
               <w:bottom w:w="50" w:type="dxa"/>
@@ -145,7 +145,9 @@
                 <w:color w:val="111827"/>
                 <w:sz w:val="26"/>
               </w:rPr>
-              <w:t>NGUYỄN VĂN CÔNG</w:t>
+              <w:t>1. NGÔ VĂN CÔNG          - LỚP: 23T_DT3 (MSSV: 102230284)</w:t>
+              <w:br/>
+              <w:t>2. NGUYỄN CÔNG MINH      - LỚP: 23T_DT3</w:t>
             </w:r>
           </w:p>
         </w:tc>
@@ -153,7 +155,7 @@
       <w:tr>
         <w:tc>
           <w:tcPr>
-            <w:tcW w:type="dxa" w:w="3312"/>
+            <w:tcW w:type="dxa" w:w="3168"/>
             <w:tcMar>
               <w:top w:w="50" w:type="dxa"/>
               <w:bottom w:w="50" w:type="dxa"/>
@@ -174,7 +176,7 @@
         </w:tc>
         <w:tc>
           <w:tcPr>
-            <w:tcW w:type="dxa" w:w="6192"/>
+            <w:tcW w:type="dxa" w:w="6336"/>
             <w:tcMar>
               <w:top w:w="50" w:type="dxa"/>
               <w:bottom w:w="50" w:type="dxa"/>
@@ -189,7 +191,7 @@
                 <w:color w:val="111827"/>
                 <w:sz w:val="26"/>
               </w:rPr>
-              <w:t>21T_DT   -   NHÓM: 21.11B</w:t>
+              <w:t>23T_DT3</w:t>
             </w:r>
           </w:p>
         </w:tc>
@@ -197,7 +199,7 @@
       <w:tr>
         <w:tc>
           <w:tcPr>
-            <w:tcW w:type="dxa" w:w="3312"/>
+            <w:tcW w:type="dxa" w:w="3168"/>
             <w:tcMar>
               <w:top w:w="50" w:type="dxa"/>
               <w:bottom w:w="50" w:type="dxa"/>
@@ -218,7 +220,7 @@
         </w:tc>
         <w:tc>
           <w:tcPr>
-            <w:tcW w:type="dxa" w:w="6192"/>
+            <w:tcW w:type="dxa" w:w="6336"/>
             <w:tcMar>
               <w:top w:w="50" w:type="dxa"/>
               <w:bottom w:w="50" w:type="dxa"/>
@@ -233,7 +235,7 @@
                 <w:color w:val="111827"/>
                 <w:sz w:val="26"/>
               </w:rPr>
-              <w:t>An toàn Thông tin</w:t>
+              <w:t>Công nghệ Thông tin (Chuyên ngành An toàn Thông tin)</w:t>
             </w:r>
           </w:p>
         </w:tc>

</xml_diff>

<commit_message>
docs: update supervisor and student author names on official cover page (#108)
Update instructor and authors on cover page.
</commit_message>
<xml_diff>
--- a/docs/reports/PBL6_Bao_Cao.docx
+++ b/docs/reports/PBL6_Bao_Cao.docx
@@ -65,7 +65,7 @@
       <w:tr>
         <w:tc>
           <w:tcPr>
-            <w:tcW w:type="dxa" w:w="3312"/>
+            <w:tcW w:type="dxa" w:w="3168"/>
             <w:tcMar>
               <w:top w:w="50" w:type="dxa"/>
               <w:bottom w:w="50" w:type="dxa"/>
@@ -86,7 +86,7 @@
         </w:tc>
         <w:tc>
           <w:tcPr>
-            <w:tcW w:type="dxa" w:w="6192"/>
+            <w:tcW w:type="dxa" w:w="6336"/>
             <w:tcMar>
               <w:top w:w="50" w:type="dxa"/>
               <w:bottom w:w="50" w:type="dxa"/>
@@ -101,7 +101,7 @@
                 <w:color w:val="111827"/>
                 <w:sz w:val="26"/>
               </w:rPr>
-              <w:t>TS. NGUYỄN THẾ XUÂN LY</w:t>
+              <w:t>NGUYỄN NĂNG HÙNG VĂN</w:t>
             </w:r>
           </w:p>
         </w:tc>
@@ -109,7 +109,7 @@
       <w:tr>
         <w:tc>
           <w:tcPr>
-            <w:tcW w:type="dxa" w:w="3312"/>
+            <w:tcW w:type="dxa" w:w="3168"/>
             <w:tcMar>
               <w:top w:w="50" w:type="dxa"/>
               <w:bottom w:w="50" w:type="dxa"/>
@@ -130,7 +130,7 @@
         </w:tc>
         <w:tc>
           <w:tcPr>
-            <w:tcW w:type="dxa" w:w="6192"/>
+            <w:tcW w:type="dxa" w:w="6336"/>
             <w:tcMar>
               <w:top w:w="50" w:type="dxa"/>
               <w:bottom w:w="50" w:type="dxa"/>
@@ -145,7 +145,9 @@
                 <w:color w:val="111827"/>
                 <w:sz w:val="26"/>
               </w:rPr>
-              <w:t>NGUYỄN VĂN CÔNG</w:t>
+              <w:t>1. NGÔ VĂN CÔNG          - LỚP: 23T_DT3 (MSSV: 102230284)</w:t>
+              <w:br/>
+              <w:t>2. NGUYỄN CÔNG MINH      - LỚP: 23T_DT3</w:t>
             </w:r>
           </w:p>
         </w:tc>
@@ -153,7 +155,7 @@
       <w:tr>
         <w:tc>
           <w:tcPr>
-            <w:tcW w:type="dxa" w:w="3312"/>
+            <w:tcW w:type="dxa" w:w="3168"/>
             <w:tcMar>
               <w:top w:w="50" w:type="dxa"/>
               <w:bottom w:w="50" w:type="dxa"/>
@@ -174,7 +176,7 @@
         </w:tc>
         <w:tc>
           <w:tcPr>
-            <w:tcW w:type="dxa" w:w="6192"/>
+            <w:tcW w:type="dxa" w:w="6336"/>
             <w:tcMar>
               <w:top w:w="50" w:type="dxa"/>
               <w:bottom w:w="50" w:type="dxa"/>
@@ -189,7 +191,7 @@
                 <w:color w:val="111827"/>
                 <w:sz w:val="26"/>
               </w:rPr>
-              <w:t>21T_DT   -   NHÓM: 21.11B</w:t>
+              <w:t>23T_DT3</w:t>
             </w:r>
           </w:p>
         </w:tc>
@@ -197,7 +199,7 @@
       <w:tr>
         <w:tc>
           <w:tcPr>
-            <w:tcW w:type="dxa" w:w="3312"/>
+            <w:tcW w:type="dxa" w:w="3168"/>
             <w:tcMar>
               <w:top w:w="50" w:type="dxa"/>
               <w:bottom w:w="50" w:type="dxa"/>
@@ -218,7 +220,7 @@
         </w:tc>
         <w:tc>
           <w:tcPr>
-            <w:tcW w:type="dxa" w:w="6192"/>
+            <w:tcW w:type="dxa" w:w="6336"/>
             <w:tcMar>
               <w:top w:w="50" w:type="dxa"/>
               <w:bottom w:w="50" w:type="dxa"/>
@@ -233,7 +235,7 @@
                 <w:color w:val="111827"/>
                 <w:sz w:val="26"/>
               </w:rPr>
-              <w:t>An toàn Thông tin</w:t>
+              <w:t>Công nghệ Thông tin (Chuyên ngành An toàn Thông tin)</w:t>
             </w:r>
           </w:p>
         </w:tc>

</xml_diff>